<commit_message>
Cập nhật skill và tài liệu plan các feature mới
Co-Authored-By: Claude Opus 5 (1M context) <noreply@anthropic.com>
</commit_message>
<xml_diff>
--- a/hrm/.plans/gop-db/warranty-repair-handle-request/Mô tả nghiệp vụ - Phiếu xử lý yêu cầu.docx
+++ b/hrm/.plans/gop-db/warranty-repair-handle-request/Mô tả nghiệp vụ - Phiếu xử lý yêu cầu.docx
@@ -1711,7 +1711,204 @@
         <w:pStyle w:val="Heading1"/>
       </w:pPr>
       <w:r>
-        <w:t>9. TRA CỨU, IN VÀ XUẤT DỮ LIỆU</w:t>
+        <w:t>9. CÁC LỐI VÀO MÀN HÌNH</w:t>
+      </w:r>
+    </w:p>
+    <w:p>
+      <w:pPr>
+        <w:jc w:val="both"/>
+      </w:pPr>
+      <w:r>
+        <w:t>Cùng một màn hình nhưng vào bằng những đường dẫn khác nhau thì danh sách hiện ra khác nhau — đây là cách hệ thống cũ đang chạy và hệ thống mới giữ nguyên. Đường dẫn đầy đủ là địa chỉ máy chủ ghép với phần dưới đây.</w:t>
+      </w:r>
+    </w:p>
+    <w:p>
+      <w:pPr>
+        <w:jc w:val="both"/>
+      </w:pPr>
+      <w:r>
+        <w:t>Màn hình: /customer-care/warranty-repair-handle-requests</w:t>
+      </w:r>
+    </w:p>
+    <w:tbl>
+      <w:tblPr>
+        <w:tblStyle w:val="LightGrid-Accent1"/>
+        <w:tblW w:type="auto" w:w="0"/>
+        <w:jc w:val="center"/>
+        <w:tblLook w:firstColumn="1" w:firstRow="1" w:lastColumn="0" w:lastRow="0" w:noHBand="0" w:noVBand="1" w:val="04A0"/>
+      </w:tblPr>
+      <w:tblGrid>
+        <w:gridCol w:w="2880"/>
+        <w:gridCol w:w="2880"/>
+        <w:gridCol w:w="2880"/>
+      </w:tblGrid>
+      <w:tr>
+        <w:tc>
+          <w:tcPr>
+            <w:tcW w:type="dxa" w:w="2880"/>
+          </w:tcPr>
+          <w:p>
+            <w:r>
+              <w:t>Vào bằng</w:t>
+            </w:r>
+          </w:p>
+        </w:tc>
+        <w:tc>
+          <w:tcPr>
+            <w:tcW w:type="dxa" w:w="2880"/>
+          </w:tcPr>
+          <w:p>
+            <w:r>
+              <w:t>Danh sách hiện ra</w:t>
+            </w:r>
+          </w:p>
+        </w:tc>
+        <w:tc>
+          <w:tcPr>
+            <w:tcW w:type="dxa" w:w="2880"/>
+          </w:tcPr>
+          <w:p>
+            <w:r>
+              <w:t>Dùng khi nào</w:t>
+            </w:r>
+          </w:p>
+        </w:tc>
+      </w:tr>
+      <w:tr>
+        <w:tc>
+          <w:tcPr>
+            <w:tcW w:type="dxa" w:w="2880"/>
+          </w:tcPr>
+          <w:p>
+            <w:r>
+              <w:t>(không kèm gì)</w:t>
+            </w:r>
+          </w:p>
+        </w:tc>
+        <w:tc>
+          <w:tcPr>
+            <w:tcW w:type="dxa" w:w="2880"/>
+          </w:tcPr>
+          <w:p>
+            <w:r>
+              <w:t>Chỉ phiếu do chính tôi lập</w:t>
+            </w:r>
+          </w:p>
+        </w:tc>
+        <w:tc>
+          <w:tcPr>
+            <w:tcW w:type="dxa" w:w="2880"/>
+          </w:tcPr>
+          <w:p>
+            <w:r>
+              <w:t>Xem lại việc của mình</w:t>
+            </w:r>
+          </w:p>
+        </w:tc>
+      </w:tr>
+      <w:tr>
+        <w:tc>
+          <w:tcPr>
+            <w:tcW w:type="dxa" w:w="2880"/>
+          </w:tcPr>
+          <w:p>
+            <w:r>
+              <w:t>?type=all</w:t>
+            </w:r>
+          </w:p>
+        </w:tc>
+        <w:tc>
+          <w:tcPr>
+            <w:tcW w:type="dxa" w:w="2880"/>
+          </w:tcPr>
+          <w:p>
+            <w:r>
+              <w:t>Toàn bộ phiếu trong phạm vi quyền của tôi</w:t>
+            </w:r>
+          </w:p>
+        </w:tc>
+        <w:tc>
+          <w:tcPr>
+            <w:tcW w:type="dxa" w:w="2880"/>
+          </w:tcPr>
+          <w:p>
+            <w:r>
+              <w:t>Lối vào chính từ menu</w:t>
+            </w:r>
+          </w:p>
+        </w:tc>
+      </w:tr>
+      <w:tr>
+        <w:tc>
+          <w:tcPr>
+            <w:tcW w:type="dxa" w:w="2880"/>
+          </w:tcPr>
+          <w:p>
+            <w:r>
+              <w:t>?type=waiting_information</w:t>
+            </w:r>
+          </w:p>
+        </w:tc>
+        <w:tc>
+          <w:tcPr>
+            <w:tcW w:type="dxa" w:w="2880"/>
+          </w:tcPr>
+          <w:p>
+            <w:r>
+              <w:t>Phiếu đang chờ lập phiếu cung cấp thông tin làm báo giá</w:t>
+            </w:r>
+          </w:p>
+        </w:tc>
+        <w:tc>
+          <w:tcPr>
+            <w:tcW w:type="dxa" w:w="2880"/>
+          </w:tcPr>
+          <w:p>
+            <w:r>
+              <w:t>Danh sách việc còn tồn</w:t>
+            </w:r>
+          </w:p>
+        </w:tc>
+      </w:tr>
+    </w:tbl>
+    <w:p>
+      <w:pPr>
+        <w:jc w:val="both"/>
+      </w:pPr>
+      <w:r>
+        <w:t>Ba điều cần biết:</w:t>
+      </w:r>
+    </w:p>
+    <w:p>
+      <w:pPr>
+        <w:pStyle w:val="ListBullet"/>
+      </w:pPr>
+      <w:r>
+        <w:t>Đường dẫn quyết định PHẠM VI xem, không phải quyền: người không có quyền xem theo cấp mà mở đường dẫn xem tất cả thì vẫn chỉ thấy phiếu của chính mình.</w:t>
+      </w:r>
+    </w:p>
+    <w:p>
+      <w:pPr>
+        <w:pStyle w:val="ListBullet"/>
+      </w:pPr>
+      <w:r>
+        <w:t>Bấm nút Làm mới chỉ xoá điều kiện lọc, không đưa người dùng sang phạm vi khác.</w:t>
+      </w:r>
+    </w:p>
+    <w:p>
+      <w:pPr>
+        <w:pStyle w:val="ListBullet"/>
+      </w:pPr>
+      <w:r>
+        <w:t>Đường dẫn kèm giá trị lạ thì hệ thống bỏ qua và giữ phạm vi mặc định.</w:t>
+      </w:r>
+    </w:p>
+    <w:p>
+      <w:pPr>
+        <w:pStyle w:val="Heading1"/>
+      </w:pPr>
+      <w:r>
+        <w:t>10. TRA CỨU, IN VÀ XUẤT DỮ LIỆU</w:t>
       </w:r>
     </w:p>
     <w:p>
@@ -2007,7 +2204,7 @@
         <w:pStyle w:val="Heading1"/>
       </w:pPr>
       <w:r>
-        <w:t>11. GIỚI HẠN HIỆN TẠI</w:t>
+        <w:t>12. GIỚI HẠN HIỆN TẠI</w:t>
       </w:r>
     </w:p>
     <w:p>

</xml_diff>